<commit_message>
Actualizar cita de El segundo sexo con edicion 2017 y traductor A. Martorell
Dato aportado directamente por la autora (no verificado contra el PDF de
Bibliografia/, que no lo incluye). Se actualizan las 4 citas narrativas
de Beauvoir en el texto de (1949) a (1949/2017) y la entrada bibliografica,
formato APA 7 para obras traducidas. No fue posible usar el complemento
Mendeley Cite instalado en Word (sin herramienta de automatizacion de
escritorio ni de inicio de sesion); se aplico el mismo resultado editando
el documento directamente.

Co-Authored-By: Claude Sonnet 5 <noreply@anthropic.com>
</commit_message>
<xml_diff>
--- a/Monografia Maria Kamila Vega version 3.docx
+++ b/Monografia Maria Kamila Vega version 3.docx
@@ -214,6 +214,10 @@
     <w:sdt>
       <w:sdtPr>
         <w:rPr>
+          <w:rFonts w:ascii="Arial" w:eastAsia="Georgia" w:hAnsi="Arial" w:cs="Georgia"/>
+          <w:color w:val="auto"/>
+          <w:sz w:val="24"/>
+          <w:szCs w:val="24"/>
           <w:lang w:val="es-ES"/>
         </w:rPr>
         <w:id w:val="-681038510"/>
@@ -224,12 +228,8 @@
       </w:sdtPr>
       <w:sdtEndPr>
         <w:rPr>
-          <w:rFonts w:ascii="Arial" w:eastAsia="Georgia" w:hAnsi="Arial" w:cs="Georgia"/>
           <w:b/>
           <w:bCs/>
-          <w:color w:val="auto"/>
-          <w:sz w:val="24"/>
-          <w:szCs w:val="24"/>
         </w:rPr>
       </w:sdtEndPr>
       <w:sdtContent>
@@ -2214,10 +2214,23 @@
     </w:p>
     <w:p>
       <w:pPr>
+        <w:rPr>
+          <w:b/>
+          <w:bCs/>
+          <w:szCs w:val="30"/>
+        </w:rPr>
+      </w:pPr>
+      <w:bookmarkStart w:id="0" w:name="_Toc239022204"/>
+      <w:r>
+        <w:br w:type="page"/>
+      </w:r>
+    </w:p>
+    <w:p>
+      <w:pPr>
         <w:pStyle w:val="Ttulo1"/>
       </w:pPr>
-      <w:bookmarkStart w:id="0" w:name="_Toc239022204"/>
-      <w:r>
+      <w:r>
+        <w:lastRenderedPageBreak/>
         <w:t>Resumen</w:t>
       </w:r>
       <w:bookmarkEnd w:id="0"/>
@@ -2281,14 +2294,14 @@
         <w:rPr>
           <w:rFonts w:cs="Arial"/>
         </w:rPr>
-        <w:t xml:space="preserve"> y en la generación siguiente, la ruptura definitiva. Por su parte, "Las travesías" permite analizar una representación diferente de la mujer, marcada por el desplazamiento, la orfandad bélica y la violencia política que atraviesa casi un siglo de conflicto en el norte de Antioquia, Colombia. La comparación entre ambas obras permite comprender que el rol femenino no puede </w:t>
+        <w:t xml:space="preserve"> y en la generación siguiente, la ruptura definitiva. Por su parte, "Las travesías" permite analizar una representación diferente de la mujer, marcada por el desplazamiento, la orfandad bélica y la violencia </w:t>
       </w:r>
       <w:r>
         <w:rPr>
           <w:rFonts w:cs="Arial"/>
         </w:rPr>
         <w:lastRenderedPageBreak/>
-        <w:t>interpretarse desde una única perspectiva, ya que adquiere diferentes significados según el contexto social, cultural, histórico y familiar en el que se desarrolla.</w:t>
+        <w:t>política que atraviesa casi un siglo de conflicto en el norte de Antioquia, Colombia. La comparación entre ambas obras permite comprender que el rol femenino no puede interpretarse desde una única perspectiva, ya que adquiere diferentes significados según el contexto social, cultural, histórico y familiar en el que se desarrolla.</w:t>
       </w:r>
     </w:p>
     <w:p>
@@ -2359,7 +2372,7 @@
         <w:rPr>
           <w:rFonts w:cs="Arial"/>
         </w:rPr>
-        <w:t>El rol de la mujer no ha permanecido igual a lo largo de la historia. Como lo plantea Beauvoir (1949) en su obra "El segundo sexo", "No se nace mujer: se llega a serlo" (p. 109), lo que indica que el papel femenino no responde a una condición biológica fija, sino a un proceso de construcción social e histórica. Esta misma tesis constructivista se sostiene desde la historiografía contemporánea: Rondón González (2026) argumenta que la historiografía tradicional ha funcionado como "un espejo deformado" que privilegió las experiencias de quienes ostentaban el poder, y cuestiona el mito de que la dominación masculina sea "un fenómeno universal y atemporal". Las transformaciones sociales y culturales han permitido cuestionar algunas de las ideas que durante mucho tiempo estuvieron relacionadas con el comportamiento, las decisiones y el lugar que debía ocupar una mujer dentro de la familia y la sociedad. Sin embargo, todavía existen estereotipos, expectativas y situaciones que pueden influir en la manera en que se percibe a las mujeres y en las oportunidades que tienen para construir su propia identidad. Además, ver cómo estos aspectos aparecen representados en la literatura permite relacionarlos con realidades que todavía forman parte de la sociedad actual.</w:t>
+        <w:t>El rol de la mujer no ha permanecido igual a lo largo de la historia. Como lo plantea Beauvoir (1949/2017) en su obra "El segundo sexo", "No se nace mujer: se llega a serlo" (p. 109), lo que indica que el papel femenino no responde a una condición biológica fija, sino a un proceso de construcción social e histórica. Esta misma tesis constructivista se sostiene desde la historiografía contemporánea: Rondón González (2026) argumenta que la historiografía tradicional ha funcionado como "un espejo deformado" que privilegió las experiencias de quienes ostentaban el poder, y cuestiona el mito de que la dominación masculina sea "un fenómeno universal y atemporal". Las transformaciones sociales y culturales han permitido cuestionar algunas de las ideas que durante mucho tiempo estuvieron relacionadas con el comportamiento, las decisiones y el lugar que debía ocupar una mujer dentro de la familia y la sociedad. Sin embargo, todavía existen estereotipos, expectativas y situaciones que pueden influir en la manera en que se percibe a las mujeres y en las oportunidades que tienen para construir su propia identidad. Además, ver cómo estos aspectos aparecen representados en la literatura permite relacionarlos con realidades que todavía forman parte de la sociedad actual.</w:t>
       </w:r>
     </w:p>
     <w:p>
@@ -2374,14 +2387,14 @@
         <w:rPr>
           <w:rFonts w:cs="Arial"/>
         </w:rPr>
-        <w:t xml:space="preserve">Este cambio se nota con claridad en la época en la que están ambientadas las dos obras seleccionadas para este análisis. "Como agua para chocolate", de Laura Esquivel, sitúa la vida de sus personajes femeninos en </w:t>
+        <w:t xml:space="preserve">Este cambio se nota con claridad en la época en la que están ambientadas las dos obras seleccionadas para este análisis. "Como agua para chocolate", de Laura Esquivel, sitúa la vida de sus personajes femeninos en el contexto de la Revolución </w:t>
       </w:r>
       <w:r>
         <w:rPr>
           <w:rFonts w:cs="Arial"/>
         </w:rPr>
         <w:lastRenderedPageBreak/>
-        <w:t>el contexto de la Revolución mexicana, tal como se evidencia en el pasaje en que la tropa revolucionaria llega al rancho de la familia De la Garza y se enfrenta a Mamá Elena (Esquivel, s. f., cap. "V. Mayo"). Por su parte, "Las travesías", de Gilmer Mesa, sitúa la historia familiar narrada en el marco de casi un siglo de conflicto político colombiano: desde las guerras civiles liberal-conservadoras de inicios del siglo XX, pasando por La Violencia bipartidista de mediados de siglo y la colonización de tierras rurales en el norte de Antioquia, hasta el conflicto armado contemporáneo, cerrando con una recreación de la masacre de El Aro (Antioquia, 1997) (Mesa, 2021). Ubicar temporalmente ambas narrativas es necesario para entender que las condiciones que enfrentan los personajes femeninos de cada obra no son iguales en todo momento, sino que responden a procesos históricos y sociales concretos, que se retoman más adelante en el marco teórico de esta monografía.</w:t>
+        <w:t>mexicana, tal como se evidencia en el pasaje en que la tropa revolucionaria llega al rancho de la familia De la Garza y se enfrenta a Mamá Elena (Esquivel, s. f., cap. "V. Mayo"). Por su parte, "Las travesías", de Gilmer Mesa, sitúa la historia familiar narrada en el marco de casi un siglo de conflicto político colombiano: desde las guerras civiles liberal-conservadoras de inicios del siglo XX, pasando por La Violencia bipartidista de mediados de siglo y la colonización de tierras rurales en el norte de Antioquia, hasta el conflicto armado contemporáneo, cerrando con una recreación de la masacre de El Aro (Antioquia, 1997) (Mesa, 2021). Ubicar temporalmente ambas narrativas es necesario para entender que las condiciones que enfrentan los personajes femeninos de cada obra no son iguales en todo momento, sino que responden a procesos históricos y sociales concretos, que se retoman más adelante en el marco teórico de esta monografía.</w:t>
       </w:r>
     </w:p>
     <w:p>
@@ -2437,7 +2450,7 @@
         <w:rPr>
           <w:rFonts w:cs="Arial"/>
         </w:rPr>
-        <w:t>La importancia de esta investigación radica en visibilizar cómo el rol de la mujer se ha visto históricamente desfavorecido en distintos ámbitos. Como lo señala Beauvoir (1949), "la mujer siempre ha sido, si no la esclava del hombre, al menos su vasalla; los dos sexos jamás han compartido el mundo en pie de igualdad" (p. 7). Durante mucho tiempo, las mujeres han sido ubicadas y limitadas por normas familiares, culturales y sociales a cumplir roles específicos, relacionados principalmente con la crianza, el cuidado del hogar y el bienestar de los demás. Estas ideas han influido en la manera en que se percibe a la mujer y, en algunos casos, han condicionado sus decisiones, su autonomía y las posibilidades de construir una identidad propia.</w:t>
+        <w:t>La importancia de esta investigación radica en visibilizar cómo el rol de la mujer se ha visto históricamente desfavorecido en distintos ámbitos. Como lo señala Beauvoir (1949/2017), "la mujer siempre ha sido, si no la esclava del hombre, al menos su vasalla; los dos sexos jamás han compartido el mundo en pie de igualdad" (p. 7). Durante mucho tiempo, las mujeres han sido ubicadas y limitadas por normas familiares, culturales y sociales a cumplir roles específicos, relacionados principalmente con la crianza, el cuidado del hogar y el bienestar de los demás. Estas ideas han influido en la manera en que se percibe a la mujer y, en algunos casos, han condicionado sus decisiones, su autonomía y las posibilidades de construir una identidad propia.</w:t>
       </w:r>
     </w:p>
     <w:p>
@@ -2952,7 +2965,7 @@
         <w:rPr>
           <w:rFonts w:cs="Arial"/>
         </w:rPr>
-        <w:t>El marco teórico central de esta monografía parte de la tesis constructivista de Simone de Beauvoir (1949) en "El segundo sexo": "No se nace mujer: se llega a serlo" (p. 109). Esta afirmación sostiene que el papel femenino no responde a un destino biológico, psíquico o económico fijo, sino que es "el conjunto de la civilización" el que elabora la figura que la mujer reviste en el seno de la sociedad. Beauvoir (1949) sitúa además esta construcción en una relación histórica de desigualdad: "la mujer siempre ha sido, si no la esclava del hombre, al menos su vasalla; los dos sexos jamás han compartido el mundo en pie de igualdad" (p. 7).</w:t>
+        <w:t>El marco teórico central de esta monografía parte de la tesis constructivista de Simone de Beauvoir (1949/2017) en "El segundo sexo": "No se nace mujer: se llega a serlo" (p. 109). Esta afirmación sostiene que el papel femenino no responde a un destino biológico, psíquico o económico fijo, sino que es "el conjunto de la civilización" el que elabora la figura que la mujer reviste en el seno de la sociedad. Beauvoir (1949/2017) sitúa además esta construcción en una relación histórica de desigualdad: "la mujer siempre ha sido, si no la esclava del hombre, al menos su vasalla; los dos sexos jamás han compartido el mundo en pie de igualdad" (p. 7).</w:t>
       </w:r>
     </w:p>
     <w:p>
@@ -3007,21 +3020,7 @@
         <w:rPr>
           <w:rFonts w:cs="Arial"/>
         </w:rPr>
-        <w:t xml:space="preserve">En primer lugar, </w:t>
-      </w:r>
-      <w:proofErr w:type="spellStart"/>
-      <w:r>
-        <w:rPr>
-          <w:rFonts w:cs="Arial"/>
-        </w:rPr>
-        <w:t>Ciplijauskaité</w:t>
-      </w:r>
-      <w:proofErr w:type="spellEnd"/>
-      <w:r>
-        <w:rPr>
-          <w:rFonts w:cs="Arial"/>
-        </w:rPr>
-        <w:t xml:space="preserve"> (1986) propone el concepto del "espejo de las generaciones": la imagen recurrente del espejo en la narrativa femenina contemporánea como símbolo de continuidad y cambio entre generaciones de mujeres </w:t>
+        <w:t xml:space="preserve">En primer lugar, Ciplijauskaité (1986) propone el concepto del "espejo de las generaciones": la imagen recurrente del espejo en la narrativa femenina contemporánea como símbolo de continuidad y cambio entre generaciones de mujeres </w:t>
       </w:r>
       <w:r>
         <w:rPr>
@@ -3043,7 +3042,19 @@
         <w:rPr>
           <w:rFonts w:cs="Arial"/>
         </w:rPr>
-        <w:t>En segundo lugar, Guerra (s. f.) analiza "las topografías de la casa como matriz transgresiva en la narrativa de la mujer latinoamericana", partiendo del mito de Penélope: la casa como espacio asociado a lo femenino, extensión del espacio uterino y lugar de reclusión, en el que la mujer teje y desteje mientras el hombre viaja y regresa. Este marco se aplica de forma directa al rancho de la familia De la Garza en "Como agua para chocolate", y en particular a la cocina, espacio al que Tita queda relegada por la tradición familiar y que, paradójicamente, se convierte en el único canal disponible para expresar lo que le está prohibido decir o hacer directamente.</w:t>
+        <w:t xml:space="preserve">En segundo lugar, Guerra (s. f.) analiza </w:t>
+      </w:r>
+      <w:r>
+        <w:rPr>
+          <w:rFonts w:cs="Arial"/>
+        </w:rPr>
+        <w:t xml:space="preserve">en </w:t>
+      </w:r>
+      <w:r>
+        <w:rPr>
+          <w:rFonts w:cs="Arial"/>
+        </w:rPr>
+        <w:t>"las topografías de la casa como matriz transgresiva en la narrativa de la mujer latinoamericana", partiendo del mito de Penélope: la casa como espacio asociado a lo femenino, extensión del espacio uterino y lugar de reclusión, en el que la mujer teje y desteje mientras el hombre viaja y regresa. Este marco se aplica de forma directa al rancho de la familia De la Garza en "Como agua para chocolate", y en particular a la cocina, espacio al que Tita queda relegada por la tradición familiar y que, paradójicamente, se convierte en el único canal disponible para expresar lo que le está prohibido decir o hacer directamente.</w:t>
       </w:r>
     </w:p>
     <w:p>
@@ -3285,7 +3296,7 @@
         <w:rPr>
           <w:rFonts w:cs="Arial"/>
         </w:rPr>
-        <w:t>Beauvoir, S. de. (1949). El segundo sexo [Archivo PDF; editorial y traductor no identificados en el archivo consultado].</w:t>
+        <w:t>Beauvoir, S. de. (1949/2017). El segundo sexo (A. Martorell, Trad.) [Archivo PDF; editorial no identificada en el archivo consultado].</w:t>
       </w:r>
     </w:p>
     <w:p>
@@ -3311,19 +3322,11 @@
           <w:rFonts w:cs="Arial"/>
         </w:rPr>
       </w:pPr>
-      <w:proofErr w:type="spellStart"/>
-      <w:r>
-        <w:rPr>
-          <w:rFonts w:cs="Arial"/>
-        </w:rPr>
-        <w:t>Ciplijauskaité</w:t>
-      </w:r>
-      <w:proofErr w:type="spellEnd"/>
-      <w:r>
-        <w:rPr>
-          <w:rFonts w:cs="Arial"/>
-        </w:rPr>
-        <w:t xml:space="preserve">, B. (1986). El "espejo de las generaciones" en la narrativa femenina contemporánea. En Actas IX del Congreso de la Asociación Internacional de Hispanistas (AIH). </w:t>
+      <w:r>
+        <w:rPr>
+          <w:rFonts w:cs="Arial"/>
+        </w:rPr>
+        <w:t xml:space="preserve">Ciplijauskaité, B. (1986). El "espejo de las generaciones" en la narrativa femenina contemporánea. En Actas IX del Congreso de la Asociación Internacional de Hispanistas (AIH). </w:t>
       </w:r>
       <w:proofErr w:type="spellStart"/>
       <w:r>
@@ -3548,6 +3551,24 @@
         </w:rPr>
         <w:t>: el legado de las mujeres UT (Vol. 2, pp. 153–175). Editorial Universidad del Tolima.</w:t>
       </w:r>
+    </w:p>
+    <w:p>
+      <w:pPr>
+        <w:spacing w:after="200" w:line="300" w:lineRule="auto"/>
+        <w:ind w:left="720" w:hanging="720"/>
+        <w:rPr>
+          <w:rFonts w:cs="Arial"/>
+        </w:rPr>
+      </w:pPr>
+    </w:p>
+    <w:p>
+      <w:pPr>
+        <w:spacing w:after="200" w:line="300" w:lineRule="auto"/>
+        <w:ind w:left="720" w:hanging="720"/>
+        <w:rPr>
+          <w:rFonts w:cs="Arial"/>
+        </w:rPr>
+      </w:pPr>
     </w:p>
     <w:sectPr>
       <w:pgSz w:w="12240" w:h="15840"/>
@@ -4631,6 +4652,32 @@
 </a:theme>
 </file>
 
+<file path=word/webextensions/taskpanes.xml><?xml version="1.0" encoding="utf-8"?>
+<wetp:taskpanes xmlns:wetp="http://schemas.microsoft.com/office/webextensions/taskpanes/2010/11">
+  <wetp:taskpane dockstate="right" visibility="0" width="350" row="1">
+    <wetp:webextensionref xmlns:r="http://schemas.openxmlformats.org/officeDocument/2006/relationships" r:id="rId1"/>
+  </wetp:taskpane>
+</wetp:taskpanes>
+</file>
+
+<file path=word/webextensions/webextension1.xml><?xml version="1.0" encoding="utf-8"?>
+<we:webextension xmlns:we="http://schemas.microsoft.com/office/webextensions/webextension/2010/11" id="{46526ECE-DF6C-4311-956C-1F42524A86ED}">
+  <we:reference id="wa104382081" version="1.55.1.0" store="es-ES" storeType="OMEX"/>
+  <we:alternateReferences>
+    <we:reference id="WA104382081" version="1.55.1.0" store="WA104382081" storeType="OMEX"/>
+  </we:alternateReferences>
+  <we:properties>
+    <we:property name="MENDELEY_BIBLIOGRAPHY_IS_DIRTY" value="true"/>
+    <we:property name="MENDELEY_BIBLIOGRAPHY_LAST_MODIFIED" value="1788150415959"/>
+    <we:property name="MENDELEY_CITATIONS" value="[]"/>
+    <we:property name="MENDELEY_CITATIONS_LOCALE_CODE" value="&quot;es-MX&quot;"/>
+    <we:property name="MENDELEY_CITATIONS_STYLE" value="{&quot;id&quot;:&quot;https://www.zotero.org/styles/apa&quot;,&quot;title&quot;:&quot;APA Style 7th edition&quot;,&quot;format&quot;:&quot;author-date&quot;,&quot;defaultLocale&quot;:null,&quot;isLocaleCodeValid&quot;:true}"/>
+  </we:properties>
+  <we:bindings/>
+  <we:snapshot xmlns:r="http://schemas.openxmlformats.org/officeDocument/2006/relationships"/>
+</we:webextension>
+</file>
+
 <file path=customXml/item1.xml><?xml version="1.0" encoding="utf-8"?>
 <b:Sources xmlns:b="http://schemas.openxmlformats.org/officeDocument/2006/bibliography" xmlns="http://schemas.openxmlformats.org/officeDocument/2006/bibliography" SelectedStyle="\APASixthEditionOfficeOnline.xsl" StyleName="APA" Version="6"/>
 </file>

</xml_diff>